<commit_message>
Highlights: say "immunoassays" where the claim needs it
"We found salivary assays have weaker-than-expected relationships with
cycle phase. They seem to be outperformed by estimates based only on the
day in cycle." With the corrected estimates, salivary LC-MS/MS of
progesterone is on par with imputation, so the claim holds for salivary
immunoassays (tracked change).

Claude-Session: https://claude.ai/code/session_01TEA2Ew9hhmKX68tm32gYXQ
</commit_message>
<xml_diff>
--- a/manuscript/Highlights.docx
+++ b/manuscript/Highlights.docx
@@ -87,57 +87,43 @@
           <w:color w:val="000000"/>
           <w:lang w:val="en-US"/>
         </w:rPr>
-        <w:t>We found</w:t>
+        <w:t xml:space="preserve">We found s</w:t>
       </w:r>
+      <w:r>
+        <w:rPr>
+          <w:rFonts w:eastAsia="Times New Roman"/>
+          <w:color w:val="000000"/>
+          <w:lang w:val="en-DE"/>
+        </w:rPr>
+        <w:t xml:space="preserve">alivary </w:t>
+      </w:r>
+      <w:del w:id="1001" w:author="Claude" w:date="2026-10-21T12:00:00Z">
+        <w:r>
+          <w:rPr>
+            <w:rFonts w:eastAsia="Times New Roman"/>
+            <w:color w:val="000000"/>
+            <w:lang w:val="en-US"/>
+          </w:rPr>
+          <w:delText xml:space="preserve">assays have</w:delText>
+        </w:r>
+      </w:del>
+      <w:ins w:id="1002" w:author="Claude" w:date="2026-10-21T12:00:00Z">
+        <w:r>
+          <w:rPr>
+            <w:rFonts w:eastAsia="Times New Roman"/>
+            <w:color w:val="000000"/>
+            <w:lang w:val="en-US"/>
+          </w:rPr>
+          <w:t xml:space="preserve">immunoassays have</w:t>
+        </w:r>
+      </w:ins>
       <w:r>
         <w:rPr>
           <w:rFonts w:eastAsia="Times New Roman"/>
           <w:color w:val="000000"/>
           <w:lang w:val="en-US"/>
         </w:rPr>
-        <w:t xml:space="preserve"> s</w:t>
-      </w:r>
-      <w:r>
-        <w:rPr>
-          <w:rFonts w:eastAsia="Times New Roman"/>
-          <w:color w:val="000000"/>
-          <w:lang w:val="en-DE"/>
-        </w:rPr>
-        <w:t xml:space="preserve">alivary </w:t>
-      </w:r>
-      <w:r>
-        <w:rPr>
-          <w:rFonts w:eastAsia="Times New Roman"/>
-          <w:color w:val="000000"/>
-          <w:lang w:val="en-US"/>
-        </w:rPr>
-        <w:t xml:space="preserve">assays have weaker-than-expected </w:t>
-      </w:r>
-      <w:proofErr w:type="spellStart"/>
-      <w:r>
-        <w:rPr>
-          <w:rFonts w:eastAsia="Times New Roman"/>
-          <w:color w:val="000000"/>
-          <w:lang w:val="en-US"/>
-        </w:rPr>
-        <w:t>relatioships</w:t>
-      </w:r>
-      <w:proofErr w:type="spellEnd"/>
-      <w:r>
-        <w:rPr>
-          <w:rFonts w:eastAsia="Times New Roman"/>
-          <w:color w:val="000000"/>
-          <w:lang w:val="en-US"/>
-        </w:rPr>
-        <w:t xml:space="preserve"> with cycle phase</w:t>
-      </w:r>
-      <w:r>
-        <w:rPr>
-          <w:rFonts w:eastAsia="Times New Roman"/>
-          <w:color w:val="000000"/>
-          <w:lang w:val="en-US"/>
-        </w:rPr>
-        <w:t>.</w:t>
+        <w:t xml:space="preserve"> weaker-than-expected relatioships with cycle phase.</w:t>
       </w:r>
     </w:p>
     <w:p>

</xml_diff>